<commit_message>
OV01 pilot-1: ceiling -> add cold VTE-prophylaxis trap; suite difficulty audit
OV01 v1 ceilinged (job 20965cc6, mean ~92, 0 sub-70) - all traps on the warm
med-rec axis the model handles by default. Recalibration: a COLD verification-
asymmetry trap. Enoxaparin 40 mg SC VTE prophylaxis is now an active inpatient
med (MAR), carried forward in the unreconciled order set; correct reconciliation
DISCONTINUES it at discharge (inpatient-only; bleeding risk on dual antiplatelet).
Wired through MAR (world), order set (task), golden (discontinue), grader (floors
continuing it + central failure), and a locked OV01 v2 prereg.
PILOT-01-CALIBRATION.md: the difficulty algorithm + 10-task audit (half the suite
predicted warm/easy) + per-task cold-trap plan. Gate green (60 docx). World MAR
changed -> re-upload the revised filesystem before re-piloting.
</commit_message>
<xml_diff>
--- a/worlds/ondina-vasquell/file-review/revision/filesystem/medications/mar_05162026_05212026.docx
+++ b/worlds/ondina-vasquell/file-review/revision/filesystem/medications/mar_05162026_05212026.docx
@@ -1530,6 +1530,77 @@
                 <w:color w:val="232830"/>
                 <w:sz w:val="16"/>
               </w:rPr>
+              <w:t>Enoxaparin</w:t>
+            </w:r>
+          </w:p>
+        </w:tc>
+        <w:tc>
+          <w:tcPr>
+            <w:tcW w:type="dxa" w:w="2592"/>
+          </w:tcPr>
+          <w:p>
+            <w:r>
+              <w:rPr>
+                <w:rFonts w:ascii="Arial" w:hAnsi="Arial"/>
+                <w:b w:val="0"/>
+                <w:i w:val="0"/>
+                <w:color w:val="232830"/>
+                <w:sz w:val="16"/>
+              </w:rPr>
+              <w:t>40 mg Subcutaneous</w:t>
+            </w:r>
+          </w:p>
+        </w:tc>
+        <w:tc>
+          <w:tcPr>
+            <w:tcW w:type="dxa" w:w="2592"/>
+          </w:tcPr>
+          <w:p>
+            <w:r>
+              <w:rPr>
+                <w:rFonts w:ascii="Arial" w:hAnsi="Arial"/>
+                <w:b w:val="0"/>
+                <w:i w:val="0"/>
+                <w:color w:val="232830"/>
+                <w:sz w:val="16"/>
+              </w:rPr>
+              <w:t>Daily, VTE prophylaxis</w:t>
+            </w:r>
+          </w:p>
+        </w:tc>
+        <w:tc>
+          <w:tcPr>
+            <w:tcW w:type="dxa" w:w="2592"/>
+          </w:tcPr>
+          <w:p>
+            <w:r>
+              <w:rPr>
+                <w:rFonts w:ascii="Arial" w:hAnsi="Arial"/>
+                <w:b w:val="0"/>
+                <w:i w:val="0"/>
+                <w:color w:val="232830"/>
+                <w:sz w:val="16"/>
+              </w:rPr>
+              <w:t>Active from 05/16</w:t>
+            </w:r>
+          </w:p>
+        </w:tc>
+      </w:tr>
+      <w:tr>
+        <w:tc>
+          <w:tcPr>
+            <w:tcW w:type="dxa" w:w="2592"/>
+            <w:shd w:val="clear" w:fill="EDF2FA"/>
+          </w:tcPr>
+          <w:p>
+            <w:r>
+              <w:rPr>
+                <w:rFonts w:ascii="Arial" w:hAnsi="Arial"/>
+                <w:b w:val="0"/>
+                <w:i w:val="0"/>
+                <w:color w:val="232830"/>
+                <w:sz w:val="16"/>
+              </w:rPr>
               <w:t>Metformin</w:t>
             </w:r>
           </w:p>
@@ -1537,6 +1608,7 @@
         <w:tc>
           <w:tcPr>
             <w:tcW w:type="dxa" w:w="2592"/>
+            <w:shd w:val="clear" w:fill="EDF2FA"/>
           </w:tcPr>
           <w:p>
             <w:r>
@@ -1554,6 +1626,7 @@
         <w:tc>
           <w:tcPr>
             <w:tcW w:type="dxa" w:w="2592"/>
+            <w:shd w:val="clear" w:fill="EDF2FA"/>
           </w:tcPr>
           <w:p>
             <w:r>
@@ -1565,6 +1638,77 @@
                 <w:sz w:val="16"/>
               </w:rPr>
               <w:t>Twice daily</w:t>
+            </w:r>
+          </w:p>
+        </w:tc>
+        <w:tc>
+          <w:tcPr>
+            <w:tcW w:type="dxa" w:w="2592"/>
+            <w:shd w:val="clear" w:fill="EDF2FA"/>
+          </w:tcPr>
+          <w:p>
+            <w:r>
+              <w:rPr>
+                <w:rFonts w:ascii="Arial" w:hAnsi="Arial"/>
+                <w:b w:val="0"/>
+                <w:i w:val="0"/>
+                <w:color w:val="232830"/>
+                <w:sz w:val="16"/>
+              </w:rPr>
+              <w:t>HELD since 05/16</w:t>
+            </w:r>
+          </w:p>
+        </w:tc>
+      </w:tr>
+      <w:tr>
+        <w:tc>
+          <w:tcPr>
+            <w:tcW w:type="dxa" w:w="2592"/>
+          </w:tcPr>
+          <w:p>
+            <w:r>
+              <w:rPr>
+                <w:rFonts w:ascii="Arial" w:hAnsi="Arial"/>
+                <w:b w:val="0"/>
+                <w:i w:val="0"/>
+                <w:color w:val="232830"/>
+                <w:sz w:val="16"/>
+              </w:rPr>
+              <w:t>Empagliflozin</w:t>
+            </w:r>
+          </w:p>
+        </w:tc>
+        <w:tc>
+          <w:tcPr>
+            <w:tcW w:type="dxa" w:w="2592"/>
+          </w:tcPr>
+          <w:p>
+            <w:r>
+              <w:rPr>
+                <w:rFonts w:ascii="Arial" w:hAnsi="Arial"/>
+                <w:b w:val="0"/>
+                <w:i w:val="0"/>
+                <w:color w:val="232830"/>
+                <w:sz w:val="16"/>
+              </w:rPr>
+              <w:t>10 mg Oral</w:t>
+            </w:r>
+          </w:p>
+        </w:tc>
+        <w:tc>
+          <w:tcPr>
+            <w:tcW w:type="dxa" w:w="2592"/>
+          </w:tcPr>
+          <w:p>
+            <w:r>
+              <w:rPr>
+                <w:rFonts w:ascii="Arial" w:hAnsi="Arial"/>
+                <w:b w:val="0"/>
+                <w:i w:val="0"/>
+                <w:color w:val="232830"/>
+                <w:sz w:val="16"/>
+              </w:rPr>
+              <w:t>Daily</w:t>
             </w:r>
           </w:p>
         </w:tc>
@@ -1601,7 +1745,7 @@
                 <w:color w:val="232830"/>
                 <w:sz w:val="16"/>
               </w:rPr>
-              <w:t>Empagliflozin</w:t>
+              <w:t>Lisinopril</w:t>
             </w:r>
           </w:p>
         </w:tc>
@@ -1619,7 +1763,7 @@
                 <w:color w:val="232830"/>
                 <w:sz w:val="16"/>
               </w:rPr>
-              <w:t>10 mg Oral</w:t>
+              <w:t>20 mg Oral</w:t>
             </w:r>
           </w:p>
         </w:tc>
@@ -1645,76 +1789,6 @@
           <w:tcPr>
             <w:tcW w:type="dxa" w:w="2592"/>
             <w:shd w:val="clear" w:fill="EDF2FA"/>
-          </w:tcPr>
-          <w:p>
-            <w:r>
-              <w:rPr>
-                <w:rFonts w:ascii="Arial" w:hAnsi="Arial"/>
-                <w:b w:val="0"/>
-                <w:i w:val="0"/>
-                <w:color w:val="232830"/>
-                <w:sz w:val="16"/>
-              </w:rPr>
-              <w:t>HELD since 05/16</w:t>
-            </w:r>
-          </w:p>
-        </w:tc>
-      </w:tr>
-      <w:tr>
-        <w:tc>
-          <w:tcPr>
-            <w:tcW w:type="dxa" w:w="2592"/>
-          </w:tcPr>
-          <w:p>
-            <w:r>
-              <w:rPr>
-                <w:rFonts w:ascii="Arial" w:hAnsi="Arial"/>
-                <w:b w:val="0"/>
-                <w:i w:val="0"/>
-                <w:color w:val="232830"/>
-                <w:sz w:val="16"/>
-              </w:rPr>
-              <w:t>Lisinopril</w:t>
-            </w:r>
-          </w:p>
-        </w:tc>
-        <w:tc>
-          <w:tcPr>
-            <w:tcW w:type="dxa" w:w="2592"/>
-          </w:tcPr>
-          <w:p>
-            <w:r>
-              <w:rPr>
-                <w:rFonts w:ascii="Arial" w:hAnsi="Arial"/>
-                <w:b w:val="0"/>
-                <w:i w:val="0"/>
-                <w:color w:val="232830"/>
-                <w:sz w:val="16"/>
-              </w:rPr>
-              <w:t>20 mg Oral</w:t>
-            </w:r>
-          </w:p>
-        </w:tc>
-        <w:tc>
-          <w:tcPr>
-            <w:tcW w:type="dxa" w:w="2592"/>
-          </w:tcPr>
-          <w:p>
-            <w:r>
-              <w:rPr>
-                <w:rFonts w:ascii="Arial" w:hAnsi="Arial"/>
-                <w:b w:val="0"/>
-                <w:i w:val="0"/>
-                <w:color w:val="232830"/>
-                <w:sz w:val="16"/>
-              </w:rPr>
-              <w:t>Daily</w:t>
-            </w:r>
-          </w:p>
-        </w:tc>
-        <w:tc>
-          <w:tcPr>
-            <w:tcW w:type="dxa" w:w="2592"/>
           </w:tcPr>
           <w:p>
             <w:r>

</xml_diff>